<commit_message>
Streamlining demo: break out Study 4 mediator/moderator measures
Updated Studies 4A and 4B to use bolded sub-paragraph leads for each
measure (Internal motivation to respond without prejudice., External
motivation to respond without prejudice., Political ideology., Political
party affiliation.) instead of bundling them into a single dense paragraph.
Easier to scan; matches the source's measure-paragraph structure.

Net of the readability gain: Studies 3A/4A/4B/5 still 152 words tighter
than the prior reverted pass.

Co-Authored-By: Claude Opus 4.7 (1M context) <noreply@anthropic.com>
</commit_message>
<xml_diff>
--- a/revision-analysis/Streamlining_Demo_Studies_3A_4_5.docx
+++ b/revision-analysis/Streamlining_Demo_Studies_3A_4_5.docx
@@ -1300,21 +1300,19 @@
     <w:p>
       <w:r>
         <w:rPr>
-          <w:b w:val="0"/>
+          <w:b/>
           <w:i w:val="0"/>
           <w:sz w:val="22"/>
         </w:rPr>
-        <w:t>Internal motivation to respond without prejudice. To assess the extent to which participants considered internal motives (e.g., image concerns) when deciding which final author to select, we adapted four items from Plant and Devine’s (1998) internal motivation to respond without prejudice scale (e.g., “Given my personal values and beliefs, an important factor in my selection of the seventh author to add to my list was my desire to promote the success of racial minorities.”; Cronbach’s α = 0.93). Each item was collected on a scale from 1 (Strongly disagree) to 7 (Strongly agree). As pre-registered, we collapsed the items into a single scale by z-scoring and then averaging them.</w:t>
-      </w:r>
-    </w:p>
-    <w:p>
+        <w:t>Internal motivation to respond without prejudice.</w:t>
+      </w:r>
       <w:r>
         <w:rPr>
           <w:b w:val="0"/>
           <w:i w:val="0"/>
           <w:sz w:val="22"/>
         </w:rPr>
-        <w:t>External motivation to respond without prejudice. To assess the extent to which participants considered external motives (e.g., reputational concerns) when deciding on which final author to select, we adapted three items from Plant and Devine’s external motivation to respond without prejudice scale (e.g., “When making my decision about who to select as my seventh author, I considered the social pressures I face to appear to promote racial minorities where they are typically underrepresented.”; Cronbach’s α = 0.90). Each item was collected on a scale from 1 (Strongly disagree) to 7 (Strongly agree). As pre-registered, we collapsed the items on a single scale by z-scoring and then averaging them.</w:t>
+        <w:t xml:space="preserve"> To assess the extent to which participants considered internal motives (e.g., image concerns) when deciding which final author to select, we adapted four items from Plant and Devine’s (1998) internal motivation to respond without prejudice scale (e.g., “Given my personal values and beliefs, an important factor in my selection of the seventh author to add to my list was my desire to promote the success of racial minorities.”; Cronbach’s α = 0.93). Each item was collected on a scale from 1 (Strongly disagree) to 7 (Strongly agree). As pre-registered, we collapsed the items into a single scale by z-scoring and then averaging them.</w:t>
       </w:r>
     </w:p>
     <w:p>
@@ -1322,6 +1320,24 @@
         <w:rPr>
           <w:b/>
           <w:i w:val="0"/>
+          <w:sz w:val="22"/>
+        </w:rPr>
+        <w:t>External motivation to respond without prejudice.</w:t>
+      </w:r>
+      <w:r>
+        <w:rPr>
+          <w:b w:val="0"/>
+          <w:i w:val="0"/>
+          <w:sz w:val="22"/>
+        </w:rPr>
+        <w:t xml:space="preserve"> To assess the extent to which participants considered external motives (e.g., reputational concerns) when deciding on which final author to select, we adapted three items from Plant and Devine’s external motivation to respond without prejudice scale (e.g., “When making my decision about who to select as my seventh author, I considered the social pressures I face to appear to promote racial minorities where they are typically underrepresented.”; Cronbach’s α = 0.90). Each item was collected on a scale from 1 (Strongly disagree) to 7 (Strongly agree). As pre-registered, we collapsed the items on a single scale by z-scoring and then averaging them.</w:t>
+      </w:r>
+    </w:p>
+    <w:p>
+      <w:r>
+        <w:rPr>
+          <w:b/>
+          <w:i w:val="0"/>
           <w:sz w:val="24"/>
         </w:rPr>
         <w:t>Results</w:t>
@@ -1373,7 +1389,7 @@
           <w:i w:val="0"/>
           <w:sz w:val="24"/>
         </w:rPr>
-        <w:t>AFTER  (streamlined, 707 words; saves 459 words)</w:t>
+        <w:t>AFTER  (streamlined, 850 words; saves 316 words)</w:t>
       </w:r>
     </w:p>
     <w:p>
@@ -1439,7 +1455,43 @@
           <w:i w:val="0"/>
           <w:sz w:val="22"/>
         </w:rPr>
-        <w:t xml:space="preserve"> Participants imagined being tasked with creating a summer fiction reading list for their local library. They saw 25 real authors, each shown with a small photograph and a brief description listing the author’s name (e.g., James Baldwin, Isabel Allende), most notable work (e.g., Go Tell It on the Mountain, The House of the Spirits), and a count of their total published works (e.g., authored 6 books and several short stories and poems); 8 of the 25 authors (32%) were racial minorities. Participants selected an initial portfolio of six authors and were then randomly assigned to a no race feedback condition, in which they received summary statistics about the percentage of selected authors who (1) were born in the 1800s, (2) wrote more than 10 books, and (3) wrote poetry, or to a race feedback condition, in which they received feedback about the percentage of selected authors who were racial minorities alongside one or two randomly drawn pieces from the no race feedback list. After receiving feedback, participants selected a seventh and final author to recommend for the library’s summer reading list from the original candidate set, where their prior selections were highlighted. Finally, participants completed adapted Plant and Devine (1998) items measuring internal (four items; e.g., “Given my personal values and beliefs, an important factor in my selection of the seventh author to add to my list was my desire to promote the success of racial minorities.”; Cronbach’s α = 0.93) and external (three items; e.g., “When making my decision about who to select as my seventh author, I considered the social pressures I face to appear to promote racial minorities where they are typically underrepresented.”; Cronbach’s α = 0.90) motivation to respond without prejudice on 1 (Strongly disagree) to 7 (Strongly agree) scales; as pre-registered, items in each scale were z-scored and averaged. See Materials Section: Study 4A in the Appendix for complete study materials.</w:t>
+        <w:t xml:space="preserve"> Participants imagined being tasked with creating a summer fiction reading list for their local library. They saw 25 real authors, each shown with a small photograph and a brief description listing the author’s name (e.g., James Baldwin, Isabel Allende), most notable work (e.g., Go Tell It on the Mountain, The House of the Spirits), and a count of their total published works (e.g., authored 6 books and several short stories and poems); 8 of the 25 authors (32%) were racial minorities. Participants selected an initial portfolio of six authors and were then randomly assigned to a no race feedback condition, in which they received summary statistics about the percentage of selected authors who (1) were born in the 1800s, (2) wrote more than 10 books, and (3) wrote poetry, or to a race feedback condition, in which they received feedback about the percentage of selected authors who were racial minorities alongside one or two randomly drawn pieces from the no race feedback list. After receiving feedback, participants selected a seventh and final author to recommend for the library’s summer reading list from the original candidate set, where their prior selections were highlighted.</w:t>
+      </w:r>
+    </w:p>
+    <w:p>
+      <w:r>
+        <w:rPr>
+          <w:b/>
+          <w:i w:val="0"/>
+          <w:sz w:val="22"/>
+        </w:rPr>
+        <w:t>Internal motivation to respond without prejudice.</w:t>
+      </w:r>
+      <w:r>
+        <w:rPr>
+          <w:b w:val="0"/>
+          <w:i w:val="0"/>
+          <w:sz w:val="22"/>
+        </w:rPr>
+        <w:t xml:space="preserve"> To assess internal motives in the final author selection, we adapted four items from Plant and Devine’s (1998) internal motivation to respond without prejudice scale (e.g., “Given my personal values and beliefs, an important factor in my selection of the seventh author to add to my list was my desire to promote the success of racial minorities.”; Cronbach’s α = 0.93). Items used a 1 (Strongly disagree) to 7 (Strongly agree) scale and, as pre-registered, were z-scored and averaged.</w:t>
+      </w:r>
+    </w:p>
+    <w:p>
+      <w:r>
+        <w:rPr>
+          <w:b/>
+          <w:i w:val="0"/>
+          <w:sz w:val="22"/>
+        </w:rPr>
+        <w:t>External motivation to respond without prejudice.</w:t>
+      </w:r>
+      <w:r>
+        <w:rPr>
+          <w:b w:val="0"/>
+          <w:i w:val="0"/>
+          <w:sz w:val="22"/>
+        </w:rPr>
+        <w:t xml:space="preserve"> To assess external motives in the final author selection, we adapted three items from Plant and Devine’s (1998) external motivation to respond without prejudice scale (e.g., “When making my decision about who to select as my seventh author, I considered the social pressures I face to appear to promote racial minorities where they are typically underrepresented.”; Cronbach’s α = 0.90). Items used the same 1-7 scale and, as pre-registered, were z-scored and averaged. See Materials Section: Study 4A in the Appendix for complete study materials.</w:t>
       </w:r>
     </w:p>
     <w:p>
@@ -1488,7 +1540,7 @@
           <w:i/>
           <w:sz w:val="20"/>
         </w:rPr>
-        <w:t>Word count: 1166 -&gt; 707 (saved 459)</w:t>
+        <w:t>Word count: 1166 -&gt; 850 (saved 316)</w:t>
       </w:r>
     </w:p>
     <w:p/>
@@ -1611,7 +1663,7 @@
           <w:i w:val="0"/>
           <w:sz w:val="22"/>
         </w:rPr>
-        <w:t>Divergence 3 (paragraph similarity 0.51)</w:t>
+        <w:t>Divergence 3 (paragraph similarity 0.68)</w:t>
       </w:r>
     </w:p>
     <w:p>
@@ -1629,7 +1681,7 @@
           <w:i w:val="0"/>
           <w:sz w:val="20"/>
         </w:rPr>
-        <w:t>Procedure. Participants imagined being tasked with creating a summer fiction reading list for their local library. They saw 25 real authors, each shown with a small photograph and a brief description listing the author’s name (e.g., James Baldwin, Isabel Allende), most notable work (e.g., Go Tell It on the Mountain, The House of the Spirits), and a count of their total published works (e.g., authored 6 books and several short stories and poems); 8 of the 25 authors (32%) were racial minorities. Participants selected an initial portfolio of six authors and were then randomly assigned to a no race feedback condition, in which they received summary statistics about the percentage of selected authors who (1) were born in the 1800s, (2) wrote more than 10 books, and (3) wrote poetry, or to a race feedback condition, in which they received feedback about the percentage of selected authors who were racial minorities alongside one or two randomly drawn pieces from the no race feedback list. After receiving feedback, participants selected a seventh and final author to recommend for the library’s summer reading list from the original candidate set, where their prior selections were highlighted. Finally, participants completed adapted Plant and Devine (1998) items measuring internal (four items; e.g., “Given my personal values and beliefs, an important factor in my selection of the seventh author to add to my list was my desire to promote the success of racial minorities.”; Cronbach’s α = 0.93) and external (three items; e.g., “When making my decision about who to select as my seventh author, I considered the social pressures I face to appear to promote racial minorities where they are typically underrepresented.”; Cronbach’s α = 0.90) motivation to respond without prejudice on 1 (Strongly disagree) to 7 (Strongly agree) scales; as pre-registered, items in each scale were z-scored and averaged. See Materials Section: Study 4A in the Appendix for complete study materials.</w:t>
+        <w:t>Procedure. Participants imagined being tasked with creating a summer fiction reading list for their local library. They saw 25 real authors, each shown with a small photograph and a brief description listing the author’s name (e.g., James Baldwin, Isabel Allende), most notable work (e.g., Go Tell It on the Mountain, The House of the Spirits), and a count of their total published works (e.g., authored 6 books and several short stories and poems); 8 of the 25 authors (32%) were racial minorities. Participants selected an initial portfolio of six authors and were then randomly assigned to a no race feedback condition, in which they received summary statistics about the percentage of selected authors who (1) were born in the 1800s, (2) wrote more than 10 books, and (3) wrote poetry, or to a race feedback condition, in which they received feedback about the percentage of selected authors who were racial minorities alongside one or two randomly drawn pieces from the no race feedback list. After receiving feedback, participants selected a seventh and final author to recommend for the library’s summer reading list from the original candidate set, where their prior selections were highlighted.</w:t>
       </w:r>
     </w:p>
     <w:p>
@@ -1657,7 +1709,7 @@
           <w:i w:val="0"/>
           <w:sz w:val="22"/>
         </w:rPr>
-        <w:t>Divergence 4 (paragraph similarity 0.78)</w:t>
+        <w:t>Divergence 4 (paragraph similarity 0.85)</w:t>
       </w:r>
     </w:p>
     <w:p>
@@ -1675,6 +1727,98 @@
           <w:i w:val="0"/>
           <w:sz w:val="20"/>
         </w:rPr>
+        <w:t>Internal motivation to respond without prejudice. To assess internal motives in the final author selection, we adapted four items from Plant and Devine’s (1998) internal motivation to respond without prejudice scale (e.g., “Given my personal values and beliefs, an important factor in my selection of the seventh author to add to my list was my desire to promote the success of racial minorities.”; Cronbach’s α = 0.93). Items used a 1 (Strongly disagree) to 7 (Strongly agree) scale and, as pre-registered, were z-scored and averaged.</w:t>
+      </w:r>
+    </w:p>
+    <w:p>
+      <w:r>
+        <w:rPr>
+          <w:b/>
+          <w:i w:val="0"/>
+          <w:sz w:val="20"/>
+        </w:rPr>
+        <w:t xml:space="preserve">Codex: </w:t>
+      </w:r>
+      <w:r>
+        <w:rPr>
+          <w:b w:val="0"/>
+          <w:i w:val="0"/>
+          <w:sz w:val="20"/>
+        </w:rPr>
+        <w:t>Internal motivation to respond without prejudice. We adapted four items from Plant and Devine’s (1998) internal motivation to respond without prejudice scale to assess internal motives (e.g., image concerns) in the final author selection (e.g., “Given my personal values and beliefs, an important factor in my selection of the seventh author to add to my list was my desire to promote the success of racial minorities.”; Cronbach’s α = 0.93). Items were collected on 1 (Strongly disagree) to 7 (Strongly agree) scales and, as pre-registered, z-scored and averaged.</w:t>
+      </w:r>
+    </w:p>
+    <w:p>
+      <w:r>
+        <w:rPr>
+          <w:b/>
+          <w:i w:val="0"/>
+          <w:sz w:val="22"/>
+        </w:rPr>
+        <w:t>Divergence 5 (paragraph similarity 0.68)</w:t>
+      </w:r>
+    </w:p>
+    <w:p>
+      <w:r>
+        <w:rPr>
+          <w:b/>
+          <w:i w:val="0"/>
+          <w:sz w:val="20"/>
+        </w:rPr>
+        <w:t xml:space="preserve">Claude: </w:t>
+      </w:r>
+      <w:r>
+        <w:rPr>
+          <w:b w:val="0"/>
+          <w:i w:val="0"/>
+          <w:sz w:val="20"/>
+        </w:rPr>
+        <w:t>External motivation to respond without prejudice. To assess external motives in the final author selection, we adapted three items from Plant and Devine’s (1998) external motivation to respond without prejudice scale (e.g., “When making my decision about who to select as my seventh author, I considered the social pressures I face to appear to promote racial minorities where they are typically underrepresented.”; Cronbach’s α = 0.90). Items used the same 1-7 scale and, as pre-registered, were z-scored and averaged. See Materials Section: Study 4A in the Appendix for complete study materials.</w:t>
+      </w:r>
+    </w:p>
+    <w:p>
+      <w:r>
+        <w:rPr>
+          <w:b/>
+          <w:i w:val="0"/>
+          <w:sz w:val="20"/>
+        </w:rPr>
+        <w:t xml:space="preserve">Codex: </w:t>
+      </w:r>
+      <w:r>
+        <w:rPr>
+          <w:b w:val="0"/>
+          <w:i w:val="0"/>
+          <w:sz w:val="20"/>
+        </w:rPr>
+        <w:t>External motivation to respond without prejudice. We adapted three items from Plant and Devine’s external motivation to respond without prejudice scale to assess external motives (e.g., reputational concerns) in the final author selection (e.g., “When making my decision about who to select as my seventh author, I considered the social pressures I face to appear to promote racial minorities where they are typically underrepresented.”; Cronbach’s α = 0.90). Items were collected on 1 (Strongly disagree) to 7 (Strongly agree) scales and, as pre-registered, z-scored and averaged. See Materials Section: Study 4A in the Appendix for complete study materials.</w:t>
+      </w:r>
+    </w:p>
+    <w:p>
+      <w:r>
+        <w:rPr>
+          <w:b/>
+          <w:i w:val="0"/>
+          <w:sz w:val="22"/>
+        </w:rPr>
+        <w:t>Divergence 6 (paragraph similarity 0.78)</w:t>
+      </w:r>
+    </w:p>
+    <w:p>
+      <w:r>
+        <w:rPr>
+          <w:b/>
+          <w:i w:val="0"/>
+          <w:sz w:val="20"/>
+        </w:rPr>
+        <w:t xml:space="preserve">Claude: </w:t>
+      </w:r>
+      <w:r>
+        <w:rPr>
+          <w:b w:val="0"/>
+          <w:i w:val="0"/>
+          <w:sz w:val="20"/>
+        </w:rPr>
         <w:t>Results Initial selections featured racial minority authors 21.8% of the time, with balance across conditions (p = .114; see Appendix Table S7). Following our pre-registration, we ran an OLS regression with robust standard errors predicting whether the seventh and final author a participant selected was a racial minority, with assignment to the race feedback condition as the primary predictor. Participants were significantly more likely to choose a racial minority author in the race feedback condition (41.60% chose a racial minority author) than in the no race feedback condition (28.20% chose a racial minority author; B = 0.134, 95% CI = [0.075, 0.193], t(998) = 4.48, p &lt; .001; see Table S7, Model 1). The effect of assignment to the race feedback condition on subsequent selection of a racial minority author was significantly larger than the effects of assignment to receive descriptive feedback about each of the three comparison attributes (all p’s ≤ .022; see Table 2 for cross-study estimates and Table S7, Models 5-8 for the per-study system-of-equations results).</w:t>
       </w:r>
     </w:p>
@@ -1703,7 +1847,7 @@
           <w:i w:val="0"/>
           <w:sz w:val="22"/>
         </w:rPr>
-        <w:t>Divergence 5 (paragraph similarity 0.75)</w:t>
+        <w:t>Divergence 7 (paragraph similarity 0.75)</w:t>
       </w:r>
     </w:p>
     <w:p>
@@ -1740,98 +1884,6 @@
           <w:sz w:val="20"/>
         </w:rPr>
         <w:t>Mediation. Following our pre-registration, we tested each proposed mediator independently using a 10,000-sample bootstrapped mediation model and a Sobel test. The 95% bias-corrected CI for the indirect effect of internal motivation to respond without prejudice excluded zero (indirect effect = 0.06, 95% CI = [0.034, 0.09]), suggesting that internal motivation helped account for the effect of assignment to the race feedback condition on selecting a racial-minority final author. Using Imai et al.’s (2010) average causal mediation effect approach, 44.7% of the effect occurred through internal motivation to respond without prejudice. The 95% bias-corrected CI for the indirect effect of external motivation to respond without prejudice also excluded zero (indirect effect = 0.019, 95% CI = [0.005, 0.03]), suggesting that external motivation also helped account for the effect of assignment to the race feedback condition (vs. no race feedback) on selecting a racial-minority final author. Imai et al.’s average causal mediation effect approach suggested that 14.1% of the effect occurred through external motivation to respond without prejudice.</w:t>
-      </w:r>
-    </w:p>
-    <w:p>
-      <w:r>
-        <w:rPr>
-          <w:b/>
-          <w:i w:val="0"/>
-          <w:sz w:val="22"/>
-        </w:rPr>
-        <w:t>Divergence 6 — Codex paragraph not present in Claude version</w:t>
-      </w:r>
-    </w:p>
-    <w:p>
-      <w:r>
-        <w:rPr>
-          <w:b/>
-          <w:i w:val="0"/>
-          <w:sz w:val="20"/>
-        </w:rPr>
-        <w:t xml:space="preserve">Claude: </w:t>
-      </w:r>
-      <w:r>
-        <w:rPr>
-          <w:b w:val="0"/>
-          <w:i w:val="0"/>
-          <w:sz w:val="20"/>
-        </w:rPr>
-        <w:t>(no corresponding paragraph)</w:t>
-      </w:r>
-    </w:p>
-    <w:p>
-      <w:r>
-        <w:rPr>
-          <w:b/>
-          <w:i w:val="0"/>
-          <w:sz w:val="20"/>
-        </w:rPr>
-        <w:t xml:space="preserve">Codex: </w:t>
-      </w:r>
-      <w:r>
-        <w:rPr>
-          <w:b w:val="0"/>
-          <w:i w:val="0"/>
-          <w:sz w:val="20"/>
-        </w:rPr>
-        <w:t>Internal motivation to respond without prejudice. We adapted four items from Plant and Devine’s (1998) internal motivation to respond without prejudice scale to assess internal motives (e.g., image concerns) in the final author selection (e.g., “Given my personal values and beliefs, an important factor in my selection of the seventh author to add to my list was my desire to promote the success of racial minorities.”; Cronbach’s α = 0.93). Items were collected on 1 (Strongly disagree) to 7 (Strongly agree) scales and, as pre-registered, z-scored and averaged.</w:t>
-      </w:r>
-    </w:p>
-    <w:p>
-      <w:r>
-        <w:rPr>
-          <w:b/>
-          <w:i w:val="0"/>
-          <w:sz w:val="22"/>
-        </w:rPr>
-        <w:t>Divergence 7 — Codex paragraph not present in Claude version</w:t>
-      </w:r>
-    </w:p>
-    <w:p>
-      <w:r>
-        <w:rPr>
-          <w:b/>
-          <w:i w:val="0"/>
-          <w:sz w:val="20"/>
-        </w:rPr>
-        <w:t xml:space="preserve">Claude: </w:t>
-      </w:r>
-      <w:r>
-        <w:rPr>
-          <w:b w:val="0"/>
-          <w:i w:val="0"/>
-          <w:sz w:val="20"/>
-        </w:rPr>
-        <w:t>(no corresponding paragraph)</w:t>
-      </w:r>
-    </w:p>
-    <w:p>
-      <w:r>
-        <w:rPr>
-          <w:b/>
-          <w:i w:val="0"/>
-          <w:sz w:val="20"/>
-        </w:rPr>
-        <w:t xml:space="preserve">Codex: </w:t>
-      </w:r>
-      <w:r>
-        <w:rPr>
-          <w:b w:val="0"/>
-          <w:i w:val="0"/>
-          <w:sz w:val="20"/>
-        </w:rPr>
-        <w:t>External motivation to respond without prejudice. We adapted three items from Plant and Devine’s external motivation to respond without prejudice scale to assess external motives (e.g., reputational concerns) in the final author selection (e.g., “When making my decision about who to select as my seventh author, I considered the social pressures I face to appear to promote racial minorities where they are typically underrepresented.”; Cronbach’s α = 0.90). Items were collected on 1 (Strongly disagree) to 7 (Strongly agree) scales and, as pre-registered, z-scored and averaged. See Materials Section: Study 4A in the Appendix for complete study materials.</w:t>
       </w:r>
     </w:p>
     <w:p>
@@ -2372,21 +2424,19 @@
     <w:p>
       <w:r>
         <w:rPr>
-          <w:b w:val="0"/>
+          <w:b/>
           <w:i w:val="0"/>
           <w:sz w:val="22"/>
         </w:rPr>
-        <w:t>Political ideology. To measure participants’ political orientation, we used the 7-point political ideology scale from the American National Election Studies (ANES, 2022). Participants responded to the prompt “When it comes to politics, do you usually think of yourself as...?” on a scale ranging from 1 (Extremely liberal) to 7 (Extremely conservative), with 4 representing Moderate; middle of the road. This measure was centered at 4 (moderate) for analyses examining moderation effects.</w:t>
-      </w:r>
-    </w:p>
-    <w:p>
+        <w:t>Political ideology.</w:t>
+      </w:r>
       <w:r>
         <w:rPr>
           <w:b w:val="0"/>
           <w:i w:val="0"/>
           <w:sz w:val="22"/>
         </w:rPr>
-        <w:t>Political party affiliation. To assess participants’ political party identification, we adapted the party identification item from the American National Election Studies (ANES, 2022). Participants were asked “Generally speaking, do you usually think of yourself as a Republican, a Democrat, or an Independent?” and selected one of three options: Democrat, Republican, or Independent. For regression analyses, party affiliation was dummy coded with Republican as the reference category.</w:t>
+        <w:t xml:space="preserve"> To measure participants’ political orientation, we used the 7-point political ideology scale from the American National Election Studies (ANES, 2022). Participants responded to the prompt “When it comes to politics, do you usually think of yourself as...?” on a scale ranging from 1 (Extremely liberal) to 7 (Extremely conservative), with 4 representing Moderate; middle of the road. This measure was centered at 4 (moderate) for analyses examining moderation effects.</w:t>
       </w:r>
     </w:p>
     <w:p>
@@ -2394,6 +2444,24 @@
         <w:rPr>
           <w:b/>
           <w:i w:val="0"/>
+          <w:sz w:val="22"/>
+        </w:rPr>
+        <w:t>Political party affiliation.</w:t>
+      </w:r>
+      <w:r>
+        <w:rPr>
+          <w:b w:val="0"/>
+          <w:i w:val="0"/>
+          <w:sz w:val="22"/>
+        </w:rPr>
+        <w:t xml:space="preserve"> To assess participants’ political party identification, we adapted the party identification item from the American National Election Studies (ANES, 2022). Participants were asked “Generally speaking, do you usually think of yourself as a Republican, a Democrat, or an Independent?” and selected one of three options: Democrat, Republican, or Independent. For regression analyses, party affiliation was dummy coded with Republican as the reference category.</w:t>
+      </w:r>
+    </w:p>
+    <w:p>
+      <w:r>
+        <w:rPr>
+          <w:b/>
+          <w:i w:val="0"/>
           <w:sz w:val="24"/>
         </w:rPr>
         <w:t>Results</w:t>
@@ -2475,7 +2543,7 @@
           <w:i w:val="0"/>
           <w:sz w:val="24"/>
         </w:rPr>
-        <w:t>AFTER  (streamlined, 783 words; saves 552 words)</w:t>
+        <w:t>AFTER  (streamlined, 908 words; saves 427 words)</w:t>
       </w:r>
     </w:p>
     <w:p>
@@ -2547,11 +2615,73 @@
     <w:p>
       <w:r>
         <w:rPr>
-          <w:b w:val="0"/>
+          <w:b/>
           <w:i w:val="0"/>
           <w:sz w:val="22"/>
         </w:rPr>
-        <w:t>Mediator and moderator measures. After making all decisions, participants completed the same internal (Cronbach’s α = 0.93) and external (Cronbach’s α = 0.89) motivation to respond without prejudice items used in Study 4A, adapted to focus on gender prejudice. Participants also completed the 7-point political ideology scale from the American National Election Studies (ANES, 2022; 1 = Extremely liberal, 7 = Extremely conservative, centered at 4 = Moderate for moderation analyses) and the ANES party identification item (Democrat, Republican, or Independent), dummy-coded with Republican as the reference category. See Materials Section: Study 4B in the Appendix for complete study materials.</w:t>
+        <w:t>Internal motivation to respond without prejudice.</w:t>
+      </w:r>
+      <w:r>
+        <w:rPr>
+          <w:b w:val="0"/>
+          <w:i w:val="0"/>
+          <w:sz w:val="22"/>
+        </w:rPr>
+        <w:t xml:space="preserve"> We assessed internal motivation using the same four items as in Study 4A, adapted to focus on gender prejudice (Cronbach’s α = 0.93). As pre-registered, items were z-scored and averaged.</w:t>
+      </w:r>
+    </w:p>
+    <w:p>
+      <w:r>
+        <w:rPr>
+          <w:b/>
+          <w:i w:val="0"/>
+          <w:sz w:val="22"/>
+        </w:rPr>
+        <w:t>External motivation to respond without prejudice.</w:t>
+      </w:r>
+      <w:r>
+        <w:rPr>
+          <w:b w:val="0"/>
+          <w:i w:val="0"/>
+          <w:sz w:val="22"/>
+        </w:rPr>
+        <w:t xml:space="preserve"> We assessed external motivation using the same three items as in Study 4A, adapted to focus on gender prejudice (Cronbach’s α = 0.89). As pre-registered, items were z-scored and averaged.</w:t>
+      </w:r>
+    </w:p>
+    <w:p>
+      <w:r>
+        <w:rPr>
+          <w:b/>
+          <w:i w:val="0"/>
+          <w:sz w:val="22"/>
+        </w:rPr>
+        <w:t>Political ideology.</w:t>
+      </w:r>
+      <w:r>
+        <w:rPr>
+          <w:b w:val="0"/>
+          <w:i w:val="0"/>
+          <w:sz w:val="22"/>
+        </w:rPr>
+        <w:t xml:space="preserve"> We measured political ideology with the 7-point political ideology scale from the American National Election Studies (ANES, 2022), with anchors 1 (Extremely liberal) and 7 (Extremely conservative) and 4 representing Moderate. The measure was centered at 4 for moderation analyses.</w:t>
+      </w:r>
+    </w:p>
+    <w:p>
+      <w:r>
+        <w:rPr>
+          <w:b/>
+          <w:i w:val="0"/>
+          <w:sz w:val="22"/>
+        </w:rPr>
+        <w:t>Political party affiliation.</w:t>
+      </w:r>
+      <w:r>
+        <w:rPr>
+          <w:b w:val="0"/>
+          <w:i w:val="0"/>
+          <w:sz w:val="22"/>
+        </w:rPr>
+        <w:t xml:space="preserve"> We measured party identification with the ANES party identification item, on which participants selected Democrat, Republican, or Independent. For regression analyses, party affiliation was dummy coded with Republican as the reference category. See Materials Section: Study 4B in the Appendix for complete study materials.</w:t>
       </w:r>
     </w:p>
     <w:p>
@@ -2600,7 +2730,7 @@
           <w:i/>
           <w:sz w:val="20"/>
         </w:rPr>
-        <w:t>Word count: 1335 -&gt; 783 (saved 552)</w:t>
+        <w:t>Word count: 1335 -&gt; 908 (saved 427)</w:t>
       </w:r>
     </w:p>
     <w:p/>
@@ -2769,7 +2899,7 @@
           <w:i w:val="0"/>
           <w:sz w:val="22"/>
         </w:rPr>
-        <w:t>Divergence 4 (paragraph similarity 0.57)</w:t>
+        <w:t>Divergence 4 (paragraph similarity 0.46)</w:t>
       </w:r>
     </w:p>
     <w:p>
@@ -2787,7 +2917,7 @@
           <w:i w:val="0"/>
           <w:sz w:val="20"/>
         </w:rPr>
-        <w:t>Mediator and moderator measures. After making all decisions, participants completed the same internal (Cronbach’s α = 0.93) and external (Cronbach’s α = 0.89) motivation to respond without prejudice items used in Study 4A, adapted to focus on gender prejudice. Participants also completed the 7-point political ideology scale from the American National Election Studies (ANES, 2022; 1 = Extremely liberal, 7 = Extremely conservative, centered at 4 = Moderate for moderation analyses) and the ANES party identification item (Democrat, Republican, or Independent), dummy-coded with Republican as the reference category. See Materials Section: Study 4B in the Appendix for complete study materials.</w:t>
+        <w:t>Political ideology. We measured political ideology with the 7-point political ideology scale from the American National Election Studies (ANES, 2022), with anchors 1 (Extremely liberal) and 7 (Extremely conservative) and 4 representing Moderate. The measure was centered at 4 for moderation analyses.</w:t>
       </w:r>
     </w:p>
     <w:p>
@@ -2805,7 +2935,7 @@
           <w:i w:val="0"/>
           <w:sz w:val="20"/>
         </w:rPr>
-        <w:t>After making all decisions, participants completed internal (Cronbach’s α = 0.93) and external (Cronbach’s α = 0.89) motivation to respond without prejudice measures from Study 4A, adapted to focus on gender prejudice. We also measured political ideology using the 7-point ANES political ideology scale, centered at 4 (moderate), and party affiliation using an ANES party identification item, dummy coded with Republican as the reference category. See Materials Section: Study 4B in the Appendix for complete study materials.</w:t>
+        <w:t>Political ideology. We measured political ideology with the 7-point American National Election Studies (ANES, 2022) ideology scale (1 = Extremely liberal, 7 = Extremely conservative, with 4 representing Moderate). The measure was centered at 4 for moderation analyses.</w:t>
       </w:r>
     </w:p>
     <w:p>
@@ -3996,11 +4126,19 @@
     <w:p>
       <w:r>
         <w:rPr>
-          <w:b w:val="0"/>
+          <w:b/>
           <w:i w:val="0"/>
           <w:sz w:val="22"/>
         </w:rPr>
-        <w:t>Exploratory Mediation Analyses. In analyses that were not pre-registered, we found that in the women underrepresented condition there were three significant mediators of the effect of descriptive feedback on the increased selection of women: internal motivation to respond without prejudice (indirect effect = 0.103, 95% CI = [0.070, 0.139], p &lt; .001; replicating the results of Study 4), external motivation to respond without prejudice (indirect effect = 0.046, 95% CI = [0.025, 0.072], p &lt; .001; replicating the results of Study 4), and fairness concerns (indirect effect = 0.101, 95% CI = [0.067, 0.137], p &lt; .001). Fairness concerns were highly correlated with both measures of motivation to respond without prejudice (r_internal,fairness = .86; r_external,fairness = .68).</w:t>
+        <w:t>Exploratory Mediation Analyses.</w:t>
+      </w:r>
+      <w:r>
+        <w:rPr>
+          <w:b w:val="0"/>
+          <w:i w:val="0"/>
+          <w:sz w:val="22"/>
+        </w:rPr>
+        <w:t xml:space="preserve"> In analyses that were not pre-registered, we found that in the women underrepresented condition there were three significant mediators of the effect of descriptive feedback on the increased selection of women: internal motivation to respond without prejudice (indirect effect = 0.103, 95% CI = [0.070, 0.139], p &lt; .001; replicating the results of Study 4), external motivation to respond without prejudice (indirect effect = 0.046, 95% CI = [0.025, 0.072], p &lt; .001; replicating the results of Study 4), and fairness concerns (indirect effect = 0.101, 95% CI = [0.067, 0.137], p &lt; .001). Fairness concerns were highly correlated with both measures of motivation to respond without prejudice (r_internal,fairness = .86; r_external,fairness = .68).</w:t>
         <w:tab/>
         <w:t>In the women overrepresented condition, however, there was only one significant mediator of the effect of descriptive feedback on the increased selection of men: fairness concerns (indirect effect = -0.012, 95% CI [-0.026, -0.002], p = .013) mediated this effect. Neither internal motivation to respond without prejudice (indirect effect = -0.010, 95% CI [-0.024, 0.001], p = .072) nor external motivation to respond without prejudice (indirect effect = -0.003, 95% CI [-0.011, 0.003], p = .409) significantly mediated the decreased selection of women induced by descriptive feedback in the women overrepresented condition (though internal motivation to respond without prejudice was a marginally significant mediator). This is consistent with our theory that these mechanisms are only triggered when feedback suggests that a historically underrepresented group (e.g., women) has plausibly faced prejudice.</w:t>
       </w:r>
@@ -4165,11 +4303,19 @@
     <w:p>
       <w:r>
         <w:rPr>
-          <w:b w:val="0"/>
+          <w:b/>
           <w:i w:val="0"/>
           <w:sz w:val="22"/>
         </w:rPr>
-        <w:t>Mechanism measures. As in Study 4B, we assessed internal motivation to respond without prejudice using four items adapted from Plant and Devine’s (1998) scale (Cronbach’s α = 0.93) and external motivation to respond without prejudice using three items from the same scale (Cronbach’s α = 0.91). We also measured fairness concerns about gender balance using three items adapted from research on distributive justice (Adams, 1965; Colquitt, 2001), specifically asking participants to rate the extent to which, when deciding on the seventh panelist, they prioritized achieving gender balance, avoided extreme over- or under-representation of men or women, and aimed to ensure that neither men nor women were left out (Cronbach’s α = 0.90). All items used 1 (Strongly disagree) to 7 (Strongly agree) scales and were z-scored and averaged within each scale. See Materials Section: Study 5 in the Appendix for complete study materials.</w:t>
+        <w:t>Mechanism measures.</w:t>
+      </w:r>
+      <w:r>
+        <w:rPr>
+          <w:b w:val="0"/>
+          <w:i w:val="0"/>
+          <w:sz w:val="22"/>
+        </w:rPr>
+        <w:t xml:space="preserve"> As in Study 4B, we assessed internal motivation to respond without prejudice using four items adapted from Plant and Devine’s (1998) scale (Cronbach’s α = 0.93) and external motivation to respond without prejudice using three items from the same scale (Cronbach’s α = 0.91). We also measured fairness concerns about gender balance using three items adapted from research on distributive justice (Adams, 1965; Colquitt, 2001), specifically asking participants to rate the extent to which, when deciding on the seventh panelist, they prioritized achieving gender balance, avoided extreme over- or under-representation of men or women, and aimed to ensure that neither men nor women were left out (Cronbach’s α = 0.90). All items used 1 (Strongly disagree) to 7 (Strongly agree) scales and were z-scored and averaged within each scale. See Materials Section: Study 5 in the Appendix for complete study materials.</w:t>
       </w:r>
     </w:p>
     <w:p>
@@ -4215,11 +4361,19 @@
     <w:p>
       <w:r>
         <w:rPr>
-          <w:b w:val="0"/>
+          <w:b/>
           <w:i w:val="0"/>
           <w:sz w:val="22"/>
         </w:rPr>
-        <w:t>Exploratory Mediation Analyses. In non-pre-registered analyses, in the women underrepresented condition three mediators of the effect of descriptive feedback on the increased selection of women were significant: internal motivation to respond without prejudice (indirect effect = 0.103, 95% CI = [0.070, 0.139], p &lt; .001; replicating Study 4), external motivation to respond without prejudice (indirect effect = 0.046, 95% CI = [0.025, 0.072], p &lt; .001; replicating Study 4), and fairness concerns (indirect effect = 0.101, 95% CI = [0.067, 0.137], p &lt; .001). Fairness concerns were highly correlated with both motivation-to-respond-without-prejudice measures (r_internal,fairness = .86; r_external,fairness = .68). In the women overrepresented condition, only fairness concerns significantly mediated the effect of descriptive feedback on the increased selection of men (indirect effect = -0.012, 95% CI = [-0.026, -0.002], p = .013); neither internal motivation to respond without prejudice (indirect effect = -0.010, 95% CI = [-0.024, 0.001], p = .072) nor external motivation to respond without prejudice (indirect effect = -0.003, 95% CI = [-0.011, 0.003], p = .409) significantly mediated the decreased selection of women induced by descriptive feedback in the women overrepresented condition. This pattern is consistent with our theory that motivation to respond without prejudice is triggered specifically when feedback suggests that a historically underrepresented group has plausibly faced prejudice, whereas fairness concerns operate more generally when feedback highlights any imbalance.</w:t>
+        <w:t>Exploratory Mediation Analyses.</w:t>
+      </w:r>
+      <w:r>
+        <w:rPr>
+          <w:b w:val="0"/>
+          <w:i w:val="0"/>
+          <w:sz w:val="22"/>
+        </w:rPr>
+        <w:t xml:space="preserve"> In non-pre-registered analyses, in the women underrepresented condition three mediators of the effect of descriptive feedback on the increased selection of women were significant: internal motivation to respond without prejudice (indirect effect = 0.103, 95% CI = [0.070, 0.139], p &lt; .001; replicating Study 4), external motivation to respond without prejudice (indirect effect = 0.046, 95% CI = [0.025, 0.072], p &lt; .001; replicating Study 4), and fairness concerns (indirect effect = 0.101, 95% CI = [0.067, 0.137], p &lt; .001). Fairness concerns were highly correlated with both motivation-to-respond-without-prejudice measures (r_internal,fairness = .86; r_external,fairness = .68). In the women overrepresented condition, only fairness concerns significantly mediated the effect of descriptive feedback on the increased selection of men (indirect effect = -0.012, 95% CI = [-0.026, -0.002], p = .013); neither internal motivation to respond without prejudice (indirect effect = -0.010, 95% CI = [-0.024, 0.001], p = .072) nor external motivation to respond without prejudice (indirect effect = -0.003, 95% CI = [-0.011, 0.003], p = .409) significantly mediated the decreased selection of women induced by descriptive feedback in the women overrepresented condition. This pattern is consistent with our theory that motivation to respond without prejudice is triggered specifically when feedback suggests that a historically underrepresented group has plausibly faced prejudice, whereas fairness concerns operate more generally when feedback highlights any imbalance.</w:t>
       </w:r>
     </w:p>
     <w:p/>
@@ -5732,7 +5886,7 @@
           </w:tcPr>
           <w:p>
             <w:r>
-              <w:t>707</w:t>
+              <w:t>850</w:t>
             </w:r>
           </w:p>
         </w:tc>
@@ -5742,7 +5896,7 @@
           </w:tcPr>
           <w:p>
             <w:r>
-              <w:t>459</w:t>
+              <w:t>316</w:t>
             </w:r>
           </w:p>
         </w:tc>
@@ -5774,7 +5928,7 @@
           </w:tcPr>
           <w:p>
             <w:r>
-              <w:t>783</w:t>
+              <w:t>908</w:t>
             </w:r>
           </w:p>
         </w:tc>
@@ -5784,7 +5938,7 @@
           </w:tcPr>
           <w:p>
             <w:r>
-              <w:t>552</w:t>
+              <w:t>427</w:t>
             </w:r>
           </w:p>
         </w:tc>
@@ -5951,7 +6105,7 @@
               <w:rPr>
                 <w:b/>
               </w:rPr>
-              <w:t>3688</w:t>
+              <w:t>3956</w:t>
             </w:r>
           </w:p>
         </w:tc>
@@ -5964,7 +6118,7 @@
               <w:rPr>
                 <w:b/>
               </w:rPr>
-              <w:t>2796</w:t>
+              <w:t>2528</w:t>
             </w:r>
           </w:p>
         </w:tc>
@@ -5978,7 +6132,7 @@
           <w:i/>
           <w:sz w:val="20"/>
         </w:rPr>
-        <w:t>Total saved: 2796 words across 7 sections (~11.2 double-spaced pages at 250 wpm).</w:t>
+        <w:t>Total saved: 2528 words across 7 sections (~10.1 double-spaced pages at 250 wpm).</w:t>
       </w:r>
     </w:p>
     <w:sectPr>

</xml_diff>

<commit_message>
Streamlining demo: break out Study 5 mechanism measures
Study 5 now uses the same bolded sub-paragraph leads as Study 4 for the
three mechanism measures: Internal motivation to respond without prejudice.,
External motivation to respond without prejudice., and Fairness concerns.
Word count: 2,415 -> 1,488 (Claude) / 1,228 (Codex). Same scannability gain
as Study 4.

Co-Authored-By: Claude Opus 4.7 (1M context) <noreply@anthropic.com>
</commit_message>
<xml_diff>
--- a/revision-analysis/Streamlining_Demo_Studies_3A_4_5.docx
+++ b/revision-analysis/Streamlining_Demo_Studies_3A_4_5.docx
@@ -4151,7 +4151,7 @@
           <w:i w:val="0"/>
           <w:sz w:val="24"/>
         </w:rPr>
-        <w:t>AFTER  (streamlined, 1239 words; saves 1176 words)</w:t>
+        <w:t>AFTER  (streamlined, 1488 words; saves 927 words)</w:t>
       </w:r>
     </w:p>
     <w:p>
@@ -4307,7 +4307,7 @@
           <w:i w:val="0"/>
           <w:sz w:val="22"/>
         </w:rPr>
-        <w:t>Mechanism measures.</w:t>
+        <w:t>Internal motivation to respond without prejudice.</w:t>
       </w:r>
       <w:r>
         <w:rPr>
@@ -4315,7 +4315,7 @@
           <w:i w:val="0"/>
           <w:sz w:val="22"/>
         </w:rPr>
-        <w:t xml:space="preserve"> As in Study 4B, we assessed internal motivation to respond without prejudice using four items adapted from Plant and Devine’s (1998) scale (Cronbach’s α = 0.93) and external motivation to respond without prejudice using three items from the same scale (Cronbach’s α = 0.91). We also measured fairness concerns about gender balance using three items adapted from research on distributive justice (Adams, 1965; Colquitt, 2001), specifically asking participants to rate the extent to which, when deciding on the seventh panelist, they prioritized achieving gender balance, avoided extreme over- or under-representation of men or women, and aimed to ensure that neither men nor women were left out (Cronbach’s α = 0.90). All items used 1 (Strongly disagree) to 7 (Strongly agree) scales and were z-scored and averaged within each scale. See Materials Section: Study 5 in the Appendix for complete study materials.</w:t>
+        <w:t xml:space="preserve"> As in Study 4B, we assessed internal motivation to respond without prejudice using four items adapted from Plant and Devine’s (1998) scale (Cronbach’s α = 0.93). Items used a 1 (Strongly disagree) to 7 (Strongly agree) scale and were z-scored and averaged.</w:t>
       </w:r>
     </w:p>
     <w:p>
@@ -4323,6 +4323,42 @@
         <w:rPr>
           <w:b/>
           <w:i w:val="0"/>
+          <w:sz w:val="22"/>
+        </w:rPr>
+        <w:t>External motivation to respond without prejudice.</w:t>
+      </w:r>
+      <w:r>
+        <w:rPr>
+          <w:b w:val="0"/>
+          <w:i w:val="0"/>
+          <w:sz w:val="22"/>
+        </w:rPr>
+        <w:t xml:space="preserve"> As in Study 4B, we assessed external motivation to respond without prejudice using three items from the same Plant and Devine (1998) scale (Cronbach’s α = 0.91). Items used the same 1-7 scale and were z-scored and averaged.</w:t>
+      </w:r>
+    </w:p>
+    <w:p>
+      <w:r>
+        <w:rPr>
+          <w:b/>
+          <w:i w:val="0"/>
+          <w:sz w:val="22"/>
+        </w:rPr>
+        <w:t>Fairness concerns.</w:t>
+      </w:r>
+      <w:r>
+        <w:rPr>
+          <w:b w:val="0"/>
+          <w:i w:val="0"/>
+          <w:sz w:val="22"/>
+        </w:rPr>
+        <w:t xml:space="preserve"> We measured fairness concerns about gender balance using three items adapted from research on distributive justice (Adams, 1965; Colquitt, 2001), specifically asking participants to rate the extent to which, when deciding on the seventh panelist, they prioritized achieving gender balance, avoided extreme over- or under-representation of men or women, and aimed to ensure that neither men nor women were left out (Cronbach’s α = 0.90). Items used the same 1-7 scale and were z-scored and averaged. See Materials Section: Study 5 in the Appendix for complete study materials.</w:t>
+      </w:r>
+    </w:p>
+    <w:p>
+      <w:r>
+        <w:rPr>
+          <w:b/>
+          <w:i w:val="0"/>
           <w:sz w:val="24"/>
         </w:rPr>
         <w:t>Results</w:t>
@@ -4384,7 +4420,7 @@
           <w:i/>
           <w:sz w:val="20"/>
         </w:rPr>
-        <w:t>Word count: 2415 -&gt; 1239 (saved 1176)</w:t>
+        <w:t>Word count: 2415 -&gt; 1488 (saved 927)</w:t>
       </w:r>
     </w:p>
     <w:p/>
@@ -4599,7 +4635,7 @@
           <w:i w:val="0"/>
           <w:sz w:val="22"/>
         </w:rPr>
-        <w:t>Divergence 5 (paragraph similarity 0.45)</w:t>
+        <w:t>Divergence 5 (paragraph similarity 0.51)</w:t>
       </w:r>
     </w:p>
     <w:p>
@@ -4635,7 +4671,7 @@
           <w:i w:val="0"/>
           <w:sz w:val="20"/>
         </w:rPr>
-        <w:t>Methods Participants. As pre-registered (https://aspredicted.org/xt2ct6), we recruited 1,200 participants through Prolific Academic to complete a 3-minute survey for $0.75 (39.3% men; 59.0% women; 1.6% non-binary/other; Mage = 42.7; 70.0% White, 11.2% Black, 9.3% Hispanic, 8.4% Asian). Procedure. Participants imagined planning a major international business conference and selecting a panel of business leaders. They selected six panelists from a randomized list of 25 real business leaders, each shown with name (e.g., Jeff Bezos, Mary Barra), title (e.g., Founder, CEO), and company affiliation (e.g., Amazon, General Motors). After creating their six-person panel, participants received summary statistics and selected a seventh and final panelist from the original set, where their prior selections were highlighted. Participants were randomly assigned to one of four conditions in a 2 (gender feedback vs. no gender feedback) X 2 (women underrepresented vs. women overrepresented) design. In the women underrepresented conditions, the candidate list included 18 men and 6 women (25% women); in the women overrepresented conditions, it included 18 women and 6 men (75% women). In no gender feedback conditions, participants received summary statistics about the percentage of initially selected panelists who were (1) in the tech industry and (2) company founders. In gender feedback conditions, participants also received feedback about the percentage of initially selected panelists who were women. We balanced tech-industry and company-founder status by candidate gender and representation condition. We also measured potential mechanisms. As in Study 4B, we assessed internal motivation to respond without prejudice with four Plant and Devine (1998) items (Cronbach’s α = 0.93) and external motivation to respond without prejudice with three items from the same scale (Cronbach’s α = 0.91). Distinct from these MRWP measures, we assessed fairness concerns about gender balance with three distributive-justice items: prioritizing gender balance, avoiding extreme over- or under-representation of men or women, and ensuring that neither men nor women were left out (Cronbach’s α = 0.90). All items used 1 (Strongly disagree) to 7 (Strongly agree) scales and were z-scored and averaged. See Materials Section: Study 5 in the Appendix for complete study materials.</w:t>
+        <w:t>Methods Participants. As pre-registered (https://aspredicted.org/xt2ct6), we recruited 1,200 participants through Prolific Academic to complete a 3-minute survey for $0.75 (39.3% men; 59.0% women; 1.6% non-binary/other; Mage = 42.7; 70.0% White, 11.2% Black, 9.3% Hispanic, 8.4% Asian). Procedure. Participants imagined planning a major international business conference and selecting a panel of business leaders. They selected six panelists from a randomized list of 25 real business leaders, each shown with name (e.g., Jeff Bezos, Mary Barra), title (e.g., Founder, CEO), and company affiliation (e.g., Amazon, General Motors). After creating their six-person panel, participants received summary statistics and selected a seventh and final panelist from the original set, where their prior selections were highlighted. Participants were randomly assigned to one of four conditions in a 2 (gender feedback vs. no gender feedback) X 2 (women underrepresented vs. women overrepresented) design. In the women underrepresented conditions, the candidate list included 18 men and 6 women (25% women); in the women overrepresented conditions, it included 18 women and 6 men (75% women). In no gender feedback conditions, participants received summary statistics about the percentage of initially selected panelists who were (1) in the tech industry and (2) company founders. In gender feedback conditions, participants also received feedback about the percentage of initially selected panelists who were women. We balanced tech-industry and company-founder status by candidate gender and representation condition. Internal motivation to respond without prejudice. As in Study 4B, we assessed internal motivation to respond without prejudice with four Plant and Devine (1998) items (Cronbach’s α = 0.93). Items used a 1 (Strongly disagree) to 7 (Strongly agree) scale and were z-scored and averaged.</w:t>
       </w:r>
     </w:p>
     <w:p>
@@ -4645,7 +4681,7 @@
           <w:i w:val="0"/>
           <w:sz w:val="22"/>
         </w:rPr>
-        <w:t>Divergence 6 — Claude paragraph not present in Codex version</w:t>
+        <w:t>Divergence 6 (paragraph similarity 0.74)</w:t>
       </w:r>
     </w:p>
     <w:p>
@@ -4663,7 +4699,7 @@
           <w:i w:val="0"/>
           <w:sz w:val="20"/>
         </w:rPr>
-        <w:t>Mechanism measures. As in Study 4B, we assessed internal motivation to respond without prejudice using four items adapted from Plant and Devine’s (1998) scale (Cronbach’s α = 0.93) and external motivation to respond without prejudice using three items from the same scale (Cronbach’s α = 0.91). We also measured fairness concerns about gender balance using three items adapted from research on distributive justice (Adams, 1965; Colquitt, 2001), specifically asking participants to rate the extent to which, when deciding on the seventh panelist, they prioritized achieving gender balance, avoided extreme over- or under-representation of men or women, and aimed to ensure that neither men nor women were left out (Cronbach’s α = 0.90). All items used 1 (Strongly disagree) to 7 (Strongly agree) scales and were z-scored and averaged within each scale. See Materials Section: Study 5 in the Appendix for complete study materials.</w:t>
+        <w:t>Internal motivation to respond without prejudice. As in Study 4B, we assessed internal motivation to respond without prejudice using four items adapted from Plant and Devine’s (1998) scale (Cronbach’s α = 0.93). Items used a 1 (Strongly disagree) to 7 (Strongly agree) scale and were z-scored and averaged.</w:t>
       </w:r>
     </w:p>
     <w:p>
@@ -4681,6 +4717,52 @@
           <w:i w:val="0"/>
           <w:sz w:val="20"/>
         </w:rPr>
+        <w:t>External motivation to respond without prejudice. As in Study 4B, we assessed external motivation to respond without prejudice with three items from the same Plant and Devine (1998) scale (Cronbach’s α = 0.91). Items used the same 1-7 scale and were z-scored and averaged.</w:t>
+      </w:r>
+    </w:p>
+    <w:p>
+      <w:r>
+        <w:rPr>
+          <w:b/>
+          <w:i w:val="0"/>
+          <w:sz w:val="22"/>
+        </w:rPr>
+        <w:t>Divergence 7 — Claude paragraph not present in Codex version</w:t>
+      </w:r>
+    </w:p>
+    <w:p>
+      <w:r>
+        <w:rPr>
+          <w:b/>
+          <w:i w:val="0"/>
+          <w:sz w:val="20"/>
+        </w:rPr>
+        <w:t xml:space="preserve">Claude: </w:t>
+      </w:r>
+      <w:r>
+        <w:rPr>
+          <w:b w:val="0"/>
+          <w:i w:val="0"/>
+          <w:sz w:val="20"/>
+        </w:rPr>
+        <w:t>External motivation to respond without prejudice. As in Study 4B, we assessed external motivation to respond without prejudice using three items from the same Plant and Devine (1998) scale (Cronbach’s α = 0.91). Items used the same 1-7 scale and were z-scored and averaged.</w:t>
+      </w:r>
+    </w:p>
+    <w:p>
+      <w:r>
+        <w:rPr>
+          <w:b/>
+          <w:i w:val="0"/>
+          <w:sz w:val="20"/>
+        </w:rPr>
+        <w:t xml:space="preserve">Codex: </w:t>
+      </w:r>
+      <w:r>
+        <w:rPr>
+          <w:b w:val="0"/>
+          <w:i w:val="0"/>
+          <w:sz w:val="20"/>
+        </w:rPr>
         <w:t>(no corresponding paragraph)</w:t>
       </w:r>
     </w:p>
@@ -4691,7 +4773,7 @@
           <w:i w:val="0"/>
           <w:sz w:val="22"/>
         </w:rPr>
-        <w:t>Divergence 7 — Claude paragraph not present in Codex version</w:t>
+        <w:t>Divergence 8 (paragraph similarity 0.60)</w:t>
       </w:r>
     </w:p>
     <w:p>
@@ -4709,6 +4791,52 @@
           <w:i w:val="0"/>
           <w:sz w:val="20"/>
         </w:rPr>
+        <w:t>Fairness concerns. We measured fairness concerns about gender balance using three items adapted from research on distributive justice (Adams, 1965; Colquitt, 2001), specifically asking participants to rate the extent to which, when deciding on the seventh panelist, they prioritized achieving gender balance, avoided extreme over- or under-representation of men or women, and aimed to ensure that neither men nor women were left out (Cronbach’s α = 0.90). Items used the same 1-7 scale and were z-scored and averaged. See Materials Section: Study 5 in the Appendix for complete study materials.</w:t>
+      </w:r>
+    </w:p>
+    <w:p>
+      <w:r>
+        <w:rPr>
+          <w:b/>
+          <w:i w:val="0"/>
+          <w:sz w:val="20"/>
+        </w:rPr>
+        <w:t xml:space="preserve">Codex: </w:t>
+      </w:r>
+      <w:r>
+        <w:rPr>
+          <w:b w:val="0"/>
+          <w:i w:val="0"/>
+          <w:sz w:val="20"/>
+        </w:rPr>
+        <w:t>Fairness concerns. Distinct from these MRWP measures, we assessed fairness concerns about gender balance with three distributive-justice items (Adams, 1965; Colquitt, 2001): prioritizing gender balance, avoiding extreme over- or under-representation of men or women, and ensuring that neither men nor women were left out (Cronbach’s α = 0.90). Items used the same 1-7 scale and were z-scored and averaged. See Materials Section: Study 5 in the Appendix for complete study materials.</w:t>
+      </w:r>
+    </w:p>
+    <w:p>
+      <w:r>
+        <w:rPr>
+          <w:b/>
+          <w:i w:val="0"/>
+          <w:sz w:val="22"/>
+        </w:rPr>
+        <w:t>Divergence 9 — Claude paragraph not present in Codex version</w:t>
+      </w:r>
+    </w:p>
+    <w:p>
+      <w:r>
+        <w:rPr>
+          <w:b/>
+          <w:i w:val="0"/>
+          <w:sz w:val="20"/>
+        </w:rPr>
+        <w:t xml:space="preserve">Claude: </w:t>
+      </w:r>
+      <w:r>
+        <w:rPr>
+          <w:b w:val="0"/>
+          <w:i w:val="0"/>
+          <w:sz w:val="20"/>
+        </w:rPr>
         <w:t>Results Initial six-person panels were 60.7% women in the women overrepresented condition, with balance across feedback conditions (59.8% in the no gender feedback condition and 61.6% in the gender feedback condition, t(599.9) = -1.11, p = .268, 95% CI = [-0.049, 0.014]), and 21.0% women in the women underrepresented condition, also with balance across feedback conditions (20.5% in the no gender feedback condition and 21.4% in the gender feedback condition, t(596) = -0.49, p = .624, 95% CI = [-0.045, 0.027]).</w:t>
       </w:r>
     </w:p>
@@ -4737,7 +4865,7 @@
           <w:i w:val="0"/>
           <w:sz w:val="22"/>
         </w:rPr>
-        <w:t>Divergence 8 — Claude paragraph not present in Codex version</w:t>
+        <w:t>Divergence 10 — Claude paragraph not present in Codex version</w:t>
       </w:r>
     </w:p>
     <w:p>
@@ -4783,7 +4911,7 @@
           <w:i w:val="0"/>
           <w:sz w:val="22"/>
         </w:rPr>
-        <w:t>Divergence 9 — Claude paragraph not present in Codex version</w:t>
+        <w:t>Divergence 11 — Claude paragraph not present in Codex version</w:t>
       </w:r>
     </w:p>
     <w:p>
@@ -4829,7 +4957,7 @@
           <w:i w:val="0"/>
           <w:sz w:val="22"/>
         </w:rPr>
-        <w:t>Divergence 10 — Claude paragraph not present in Codex version</w:t>
+        <w:t>Divergence 12 — Claude paragraph not present in Codex version</w:t>
       </w:r>
     </w:p>
     <w:p>
@@ -4875,7 +5003,7 @@
           <w:i w:val="0"/>
           <w:sz w:val="22"/>
         </w:rPr>
-        <w:t>Divergence 11 — Codex paragraph not present in Claude version</w:t>
+        <w:t>Divergence 13 — Codex paragraph not present in Claude version</w:t>
       </w:r>
     </w:p>
     <w:p>
@@ -4921,7 +5049,7 @@
           <w:i w:val="0"/>
           <w:sz w:val="22"/>
         </w:rPr>
-        <w:t>Divergence 12 — Codex paragraph not present in Claude version</w:t>
+        <w:t>Divergence 14 — Codex paragraph not present in Claude version</w:t>
       </w:r>
     </w:p>
     <w:p>
@@ -4967,7 +5095,7 @@
           <w:i w:val="0"/>
           <w:sz w:val="22"/>
         </w:rPr>
-        <w:t>Divergence 13 — Codex paragraph not present in Claude version</w:t>
+        <w:t>Divergence 15 — Codex paragraph not present in Claude version</w:t>
       </w:r>
     </w:p>
     <w:p>
@@ -6012,7 +6140,7 @@
           </w:tcPr>
           <w:p>
             <w:r>
-              <w:t>1239</w:t>
+              <w:t>1488</w:t>
             </w:r>
           </w:p>
         </w:tc>
@@ -6022,7 +6150,7 @@
           </w:tcPr>
           <w:p>
             <w:r>
-              <w:t>1176</w:t>
+              <w:t>927</w:t>
             </w:r>
           </w:p>
         </w:tc>
@@ -6105,7 +6233,7 @@
               <w:rPr>
                 <w:b/>
               </w:rPr>
-              <w:t>3956</w:t>
+              <w:t>4205</w:t>
             </w:r>
           </w:p>
         </w:tc>
@@ -6118,7 +6246,7 @@
               <w:rPr>
                 <w:b/>
               </w:rPr>
-              <w:t>2528</w:t>
+              <w:t>2279</w:t>
             </w:r>
           </w:p>
         </w:tc>
@@ -6132,7 +6260,7 @@
           <w:i/>
           <w:sz w:val="20"/>
         </w:rPr>
-        <w:t>Total saved: 2528 words across 7 sections (~10.1 double-spaced pages at 250 wpm).</w:t>
+        <w:t>Total saved: 2279 words across 7 sections (~9.1 double-spaced pages at 250 wpm).</w:t>
       </w:r>
     </w:p>
     <w:sectPr>

</xml_diff>